<commit_message>
update DO complaint instructions
</commit_message>
<xml_diff>
--- a/docassemble/MLHDivorceAndCustody/data/templates/instructions_divorce_without_children.docx
+++ b/docassemble/MLHDivorceAndCustody/data/templates/instructions_divorce_without_children.docx
@@ -378,7 +378,6 @@
         <w:t xml:space="preserve"> does not file anything with the court. You will need to upload your documents in </w:t>
       </w:r>
       <w:hyperlink r:id="rId8">
-        <w:proofErr w:type="spellStart"/>
         <w:r>
           <w:rPr>
             <w:b/>
@@ -388,7 +387,6 @@
           </w:rPr>
           <w:t>MiFILE</w:t>
         </w:r>
-        <w:proofErr w:type="spellEnd"/>
       </w:hyperlink>
       <w:r>
         <w:rPr>
@@ -471,7 +469,6 @@
         <w:t xml:space="preserve">You will need to file your initial forms at the Circuit Court Clerk’s Office (see Step 5). But note that everything you file in your case after this initial filing will need to be e-filed using </w:t>
       </w:r>
       <w:hyperlink r:id="rId9" w:history="1">
-        <w:proofErr w:type="spellStart"/>
         <w:r>
           <w:rPr>
             <w:rStyle w:val="Hyperlink"/>
@@ -479,7 +476,6 @@
           </w:rPr>
           <w:t>MiFILE</w:t>
         </w:r>
-        <w:proofErr w:type="spellEnd"/>
       </w:hyperlink>
       <w:r>
         <w:rPr>
@@ -804,16 +800,8 @@
         <w:rPr>
           <w:color w:val="222222"/>
         </w:rPr>
-        <w:t xml:space="preserve">E-filing using </w:t>
-      </w:r>
-      <w:proofErr w:type="spellStart"/>
-      <w:r>
-        <w:rPr>
-          <w:color w:val="222222"/>
-        </w:rPr>
-        <w:t>MiFILE</w:t>
-      </w:r>
-      <w:proofErr w:type="spellEnd"/>
+        <w:t>E-filing using MiFILE</w:t>
+      </w:r>
     </w:p>
     <w:p>
       <w:pPr>
@@ -1025,7 +1013,6 @@
         </w:rPr>
       </w:pPr>
       <w:hyperlink r:id="rId15">
-        <w:proofErr w:type="spellStart"/>
         <w:r>
           <w:rPr>
             <w:color w:val="1155CC"/>
@@ -1033,120 +1020,26 @@
           </w:rPr>
           <w:t>MiFILE</w:t>
         </w:r>
-        <w:proofErr w:type="spellEnd"/>
       </w:hyperlink>
       <w:r>
         <w:rPr>
           <w:color w:val="222222"/>
         </w:rPr>
-        <w:t xml:space="preserve"> is only available for some courts. Even in courts where it is available, you can only use it for some case types. The State Court Administrative Office keeps a </w:t>
-      </w:r>
-      <w:hyperlink r:id="rId16">
+        <w:t xml:space="preserve"> is only available for some courts. Even in courts where it is available, you can only use it for some case types. </w:t>
+      </w:r>
+      <w:r>
+        <w:rPr>
+          <w:color w:val="222222"/>
+        </w:rPr>
+        <w:t>Click this link to </w:t>
+      </w:r>
+      <w:hyperlink r:id="rId16" w:history="1">
         <w:r>
           <w:rPr>
             <w:color w:val="1155CC"/>
             <w:u w:val="single"/>
           </w:rPr>
-          <w:t>chart</w:t>
-        </w:r>
-        <w:r>
-          <w:rPr>
-            <w:color w:val="1155CC"/>
-            <w:u w:val="single"/>
-          </w:rPr>
-          <w:t> </w:t>
-        </w:r>
-        <w:r>
-          <w:rPr>
-            <w:color w:val="1155CC"/>
-            <w:u w:val="single"/>
-          </w:rPr>
-          <w:t>of</w:t>
-        </w:r>
-        <w:r>
-          <w:rPr>
-            <w:color w:val="1155CC"/>
-            <w:u w:val="single"/>
-          </w:rPr>
-          <w:t> </w:t>
-        </w:r>
-        <w:r>
-          <w:rPr>
-            <w:color w:val="1155CC"/>
-            <w:u w:val="single"/>
-          </w:rPr>
-          <w:t>courts</w:t>
-        </w:r>
-        <w:r>
-          <w:rPr>
-            <w:color w:val="1155CC"/>
-            <w:u w:val="single"/>
-          </w:rPr>
-          <w:t> </w:t>
-        </w:r>
-        <w:r>
-          <w:rPr>
-            <w:color w:val="1155CC"/>
-            <w:u w:val="single"/>
-          </w:rPr>
-          <w:t>that</w:t>
-        </w:r>
-        <w:r>
-          <w:rPr>
-            <w:color w:val="1155CC"/>
-            <w:u w:val="single"/>
-          </w:rPr>
-          <w:t> </w:t>
-        </w:r>
-        <w:r>
-          <w:rPr>
-            <w:color w:val="1155CC"/>
-            <w:u w:val="single"/>
-          </w:rPr>
-          <w:t>use</w:t>
-        </w:r>
-        <w:r>
-          <w:rPr>
-            <w:color w:val="1155CC"/>
-            <w:u w:val="single"/>
-          </w:rPr>
-          <w:t> </w:t>
-        </w:r>
-        <w:r>
-          <w:rPr>
-            <w:color w:val="1155CC"/>
-            <w:u w:val="single"/>
-          </w:rPr>
-          <w:t>e</w:t>
-        </w:r>
-        <w:r>
-          <w:rPr>
-            <w:color w:val="1155CC"/>
-            <w:u w:val="single"/>
-          </w:rPr>
-          <w:noBreakHyphen/>
-        </w:r>
-        <w:r>
-          <w:rPr>
-            <w:color w:val="1155CC"/>
-            <w:u w:val="single"/>
-          </w:rPr>
-          <w:t>filing</w:t>
-        </w:r>
-      </w:hyperlink>
-      <w:r>
-        <w:rPr>
-          <w:color w:val="222222"/>
-        </w:rPr>
-        <w:t xml:space="preserve">. To learn more, read </w:t>
-      </w:r>
-      <w:hyperlink r:id="rId17">
-        <w:r>
-          <w:rPr>
-            <w:color w:val="1155CC"/>
-            <w:u w:val="single"/>
-          </w:rPr>
-          <w:t>What Is E-Filing?</w:t>
+          <w:t>check if you can e-file</w:t>
         </w:r>
       </w:hyperlink>
       <w:r>
@@ -1298,7 +1191,7 @@
         </w:rPr>
         <w:t xml:space="preserve"> If you will be filing for divorce online using Wayne County's </w:t>
       </w:r>
-      <w:hyperlink r:id="rId18">
+      <w:hyperlink r:id="rId17">
         <w:r>
           <w:rPr>
             <w:color w:val="1155CC"/>
@@ -1313,7 +1206,7 @@
         </w:rPr>
         <w:t xml:space="preserve">, filing fees must be paid before you file. Pay the filing fees at </w:t>
       </w:r>
-      <w:hyperlink r:id="rId19">
+      <w:hyperlink r:id="rId18">
         <w:r>
           <w:rPr>
             <w:color w:val="1155CC"/>
@@ -1445,7 +1338,7 @@
         </w:rPr>
         <w:t xml:space="preserve"> </w:t>
       </w:r>
-      <w:hyperlink r:id="rId20">
+      <w:hyperlink r:id="rId19">
         <w:r>
           <w:rPr>
             <w:color w:val="1155CC"/>
@@ -1617,7 +1510,7 @@
         </w:rPr>
         <w:t xml:space="preserve">If you receive public assistance based on having low income, a completed Fee Waiver Request will print out with your other documents from the Do-It-Yourself Divorce tool. Otherwise, you can use the </w:t>
       </w:r>
-      <w:hyperlink r:id="rId21">
+      <w:hyperlink r:id="rId20">
         <w:r>
           <w:rPr>
             <w:color w:val="1155CC"/>
@@ -1732,7 +1625,7 @@
         </w:rPr>
         <w:t xml:space="preserve">You can file the Fee Waiver Request online through Wayne County's Domestic Case Filings System. For more information, read </w:t>
       </w:r>
-      <w:hyperlink r:id="rId22">
+      <w:hyperlink r:id="rId21">
         <w:r>
           <w:rPr>
             <w:color w:val="1155CC"/>
@@ -1761,7 +1654,7 @@
         </w:rPr>
         <w:t xml:space="preserve">IF YOUR FEE WAIVER REQUEST IS DENIED: You have 14 days from the issue date to pay the filing fees or request a review. To request a review, fill out a </w:t>
       </w:r>
-      <w:hyperlink r:id="rId23">
+      <w:hyperlink r:id="rId22">
         <w:r>
           <w:rPr>
             <w:color w:val="1155CC"/>
@@ -1804,7 +1697,7 @@
         </w:rPr>
         <w:t xml:space="preserve">To learn more, read </w:t>
       </w:r>
-      <w:hyperlink r:id="rId24">
+      <w:hyperlink r:id="rId23">
         <w:r>
           <w:rPr>
             <w:color w:val="1155CC"/>
@@ -1933,7 +1826,7 @@
           <w:ilvl w:val="0"/>
           <w:numId w:val="9"/>
         </w:numPr>
-        <w:spacing w:after="180" w:line="240" w:lineRule="auto"/>
+        <w:spacing w:after="0" w:line="240" w:lineRule="auto"/>
       </w:pPr>
       <w:r>
         <w:rPr>
@@ -1951,6 +1844,36 @@
     </w:p>
     <w:p>
       <w:pPr>
+        <w:numPr>
+          <w:ilvl w:val="0"/>
+          <w:numId w:val="9"/>
+        </w:numPr>
+        <w:shd w:val="clear" w:color="auto" w:fill="FFFFFF"/>
+        <w:spacing w:before="100" w:beforeAutospacing="1" w:after="100" w:afterAutospacing="1" w:line="240" w:lineRule="auto"/>
+        <w:rPr>
+          <w:rFonts w:asciiTheme="minorHAnsi" w:eastAsia="Times New Roman" w:hAnsiTheme="minorHAnsi" w:cstheme="minorHAnsi"/>
+          <w:color w:val="000000"/>
+        </w:rPr>
+      </w:pPr>
+      <w:r>
+        <w:rPr>
+          <w:rFonts w:asciiTheme="minorHAnsi" w:eastAsia="Times New Roman" w:hAnsiTheme="minorHAnsi" w:cstheme="minorHAnsi"/>
+          <w:color w:val="000000"/>
+        </w:rPr>
+        <w:t>Verified Statement (if you are requesting spousal support) – </w:t>
+      </w:r>
+      <w:r>
+        <w:rPr>
+          <w:rFonts w:asciiTheme="minorHAnsi" w:eastAsia="Times New Roman" w:hAnsiTheme="minorHAnsi" w:cstheme="minorHAnsi"/>
+          <w:b/>
+          <w:bCs/>
+          <w:color w:val="000000"/>
+        </w:rPr>
+        <w:t>2 copies</w:t>
+      </w:r>
+    </w:p>
+    <w:p>
+      <w:pPr>
         <w:spacing w:before="180" w:after="180"/>
         <w:rPr>
           <w:color w:val="222222"/>
@@ -1981,6 +1904,8 @@
       <w:pPr>
         <w:spacing w:before="180" w:after="180"/>
         <w:rPr>
+          <w:b/>
+          <w:bCs/>
           <w:color w:val="222222"/>
         </w:rPr>
       </w:pPr>
@@ -2046,7 +1971,51 @@
         <w:rPr>
           <w:color w:val="222222"/>
         </w:rPr>
-        <w:t>After you sign your documents, make copies as follows. In some counties the court clerk’s office will make the copies for you. You can call the clerk’s office ahead of time to ask whether you need to make your own copies.</w:t>
+        <w:t xml:space="preserve">- </w:t>
+      </w:r>
+      <w:r>
+        <w:rPr>
+          <w:b/>
+          <w:bCs/>
+          <w:color w:val="222222"/>
+        </w:rPr>
+        <w:t>If you are requesting spousal support, find out if you need Friend of the Court copies.</w:t>
+      </w:r>
+      <w:r>
+        <w:rPr>
+          <w:color w:val="222222"/>
+        </w:rPr>
+        <w:t xml:space="preserve"> If you will be filing at the court clerk’s office or by mail, contact the clerk’s office to find out if you need to provide extra copies of the documents you file to the Friend of the Court (FOC). Some but not all courts require FOC copies. If your court wants FOC copies, ask how they want you to provide them. Some courts may want you to label the copies “Friend of the Court” and file them along with your other documents in the clerk’s office. Other courts may require you to mail or deliver the copies to the FOC office. </w:t>
+      </w:r>
+      <w:r>
+        <w:rPr>
+          <w:b/>
+          <w:bCs/>
+          <w:color w:val="222222"/>
+        </w:rPr>
+        <w:t>If you are filing by MiFILE or email, or if you are not requesting spousal support, you will not need Friend of the Court copies.</w:t>
+      </w:r>
+    </w:p>
+    <w:p>
+      <w:pPr>
+        <w:spacing w:before="180" w:after="180"/>
+        <w:rPr>
+          <w:color w:val="222222"/>
+        </w:rPr>
+      </w:pPr>
+      <w:r>
+        <w:rPr>
+          <w:color w:val="222222"/>
+        </w:rPr>
+        <w:t>-Make the following copies. </w:t>
+      </w:r>
+      <w:r>
+        <w:rPr>
+          <w:b/>
+          <w:bCs/>
+          <w:color w:val="222222"/>
+        </w:rPr>
+        <w:t>If your court requires FOC copies, make one extra copy of each document.</w:t>
       </w:r>
       <w:r>
         <w:rPr>
@@ -2120,7 +2089,7 @@
           <w:ilvl w:val="0"/>
           <w:numId w:val="3"/>
         </w:numPr>
-        <w:spacing w:after="180"/>
+        <w:spacing w:after="0"/>
       </w:pPr>
       <w:r>
         <w:rPr>
@@ -2138,144 +2107,142 @@
     </w:p>
     <w:p>
       <w:pPr>
-        <w:spacing w:before="180" w:after="180"/>
-        <w:rPr>
-          <w:color w:val="222222"/>
-        </w:rPr>
-      </w:pPr>
-      <w:r>
-        <w:rPr>
-          <w:color w:val="222222"/>
-        </w:rPr>
-        <w:t>The original of each document gets filed with the court. Copies of the documents are for the Plaintiff (yo</w:t>
-      </w:r>
-      <w:r>
-        <w:rPr>
-          <w:color w:val="222222"/>
-        </w:rPr>
-        <w:t>u) and Defendant (your spouse).</w:t>
-      </w:r>
-    </w:p>
-    <w:p>
-      <w:pPr>
-        <w:spacing w:before="180" w:after="180"/>
-        <w:rPr>
+        <w:numPr>
+          <w:ilvl w:val="0"/>
+          <w:numId w:val="3"/>
+        </w:numPr>
+        <w:shd w:val="clear" w:color="auto" w:fill="FFFFFF"/>
+        <w:spacing w:before="100" w:beforeAutospacing="1" w:after="100" w:afterAutospacing="1" w:line="240" w:lineRule="auto"/>
+        <w:rPr>
+          <w:rFonts w:asciiTheme="minorHAnsi" w:eastAsia="Times New Roman" w:hAnsiTheme="minorHAnsi" w:cstheme="minorHAnsi"/>
+          <w:color w:val="000000"/>
+        </w:rPr>
+      </w:pPr>
+      <w:r>
+        <w:rPr>
+          <w:rFonts w:asciiTheme="minorHAnsi" w:eastAsia="Times New Roman" w:hAnsiTheme="minorHAnsi" w:cstheme="minorHAnsi"/>
+          <w:color w:val="000000"/>
+        </w:rPr>
+        <w:t>Verified Statement (if you are requesting spousal support) – </w:t>
+      </w:r>
+      <w:r>
+        <w:rPr>
+          <w:rFonts w:asciiTheme="minorHAnsi" w:eastAsia="Times New Roman" w:hAnsiTheme="minorHAnsi" w:cstheme="minorHAnsi"/>
           <w:b/>
-          <w:color w:val="222222"/>
-        </w:rPr>
-      </w:pPr>
-      <w:r>
-        <w:rPr>
+          <w:bCs/>
+          <w:color w:val="000000"/>
+        </w:rPr>
+        <w:t>2 copies</w:t>
+      </w:r>
+    </w:p>
+    <w:p>
+      <w:pPr>
+        <w:spacing w:before="180" w:after="180"/>
+        <w:rPr>
+          <w:color w:val="222222"/>
+        </w:rPr>
+      </w:pPr>
+      <w:r>
+        <w:rPr>
+          <w:b/>
+          <w:bCs/>
+          <w:color w:val="222222"/>
+        </w:rPr>
+        <w:t>In some counties, the court clerk’s office will make the copies for you. You can call the clerk’s office ahead of time to ask if they can do this.</w:t>
+      </w:r>
+    </w:p>
+    <w:p>
+      <w:pPr>
+        <w:spacing w:before="180" w:after="180"/>
+        <w:rPr>
+          <w:color w:val="222222"/>
+        </w:rPr>
+      </w:pPr>
+      <w:r>
+        <w:rPr>
+          <w:color w:val="222222"/>
+        </w:rPr>
+        <w:t xml:space="preserve">The original of each document gets filed with the court </w:t>
+      </w:r>
+      <w:r>
+        <w:rPr>
+          <w:color w:val="222222"/>
+        </w:rPr>
+        <w:t>if you are filing in person or by mail</w:t>
+      </w:r>
+      <w:r>
+        <w:rPr>
+          <w:color w:val="222222"/>
+        </w:rPr>
+        <w:t>. Copies of the documents are for each of the following: Plaintiff (you), Defendant (your spouse), and the Friend of the Court, if needed.</w:t>
+      </w:r>
+    </w:p>
+    <w:p>
+      <w:pPr>
+        <w:spacing w:before="180" w:after="180"/>
+        <w:rPr>
+          <w:color w:val="222222"/>
+        </w:rPr>
+      </w:pPr>
+      <w:r>
+        <w:rPr>
+          <w:b/>
+          <w:bCs/>
           <w:color w:val="222222"/>
           <w:highlight w:val="white"/>
         </w:rPr>
-        <w:t xml:space="preserve">If you are asking for spousal support in your complaint for divorce, make a third copy of each document </w:t>
-      </w:r>
-      <w:r>
-        <w:rPr>
-          <w:highlight w:val="white"/>
-        </w:rPr>
-        <w:t xml:space="preserve">for the Friend of the Court if you will </w:t>
-      </w:r>
-      <w:r>
-        <w:rPr>
-          <w:color w:val="222222"/>
-          <w:highlight w:val="white"/>
-        </w:rPr>
-        <w:t xml:space="preserve">file in person at the courthouse or by regular mail. </w:t>
-      </w:r>
-      <w:r>
-        <w:rPr>
-          <w:b/>
-          <w:color w:val="222222"/>
-          <w:highlight w:val="white"/>
-        </w:rPr>
-        <w:t xml:space="preserve">If you will file either by e-mail or using </w:t>
+        <w:t>If you are filing by MiFILE or email, you will only need copies for yourself and the other party.</w:t>
+      </w:r>
+      <w:r>
+        <w:rPr>
+          <w:color w:val="222222"/>
+        </w:rPr>
+        <w:t>{%p endif %}</w:t>
+      </w:r>
+      <w:r>
+        <w:rPr>
+          <w:color w:val="222222"/>
+        </w:rPr>
+        <w:t xml:space="preserve"> </w:t>
+      </w:r>
+      <w:r>
+        <w:rPr>
+          <w:color w:val="BFBFBF" w:themeColor="background1" w:themeShade="BF"/>
+        </w:rPr>
+        <w:t>// If Wayne</w:t>
+      </w:r>
+    </w:p>
+    <w:p>
+      <w:pPr>
+        <w:pStyle w:val="Heading3"/>
+      </w:pPr>
+      <w:r>
+        <w:t>Step 5: File your forms with filing fee</w:t>
+      </w:r>
+    </w:p>
+    <w:p>
+      <w:pPr>
+        <w:spacing w:before="180" w:after="180"/>
+        <w:rPr>
+          <w:color w:val="222222"/>
+        </w:rPr>
+      </w:pPr>
+      <w:r>
+        <w:rPr>
+          <w:color w:val="222222"/>
+        </w:rPr>
+        <w:t xml:space="preserve">{%p if </w:t>
       </w:r>
       <w:proofErr w:type="spellStart"/>
       <w:r>
         <w:rPr>
-          <w:b/>
-          <w:color w:val="222222"/>
-          <w:highlight w:val="white"/>
-        </w:rPr>
-        <w:t>MiFILE</w:t>
+          <w:color w:val="222222"/>
+        </w:rPr>
+        <w:t>county_choice</w:t>
       </w:r>
       <w:proofErr w:type="spellEnd"/>
       <w:r>
         <w:rPr>
-          <w:b/>
-          <w:color w:val="222222"/>
-          <w:highlight w:val="white"/>
-        </w:rPr>
-        <w:t>, you will not need to file an extra co</w:t>
-      </w:r>
-      <w:r>
-        <w:rPr>
-          <w:b/>
-          <w:color w:val="222222"/>
-          <w:highlight w:val="white"/>
-        </w:rPr>
-        <w:t>py for the Friend of the Court.</w:t>
-      </w:r>
-    </w:p>
-    <w:p>
-      <w:pPr>
-        <w:spacing w:before="180" w:after="180"/>
-        <w:rPr>
-          <w:color w:val="222222"/>
-        </w:rPr>
-      </w:pPr>
-      <w:r>
-        <w:rPr>
-          <w:color w:val="222222"/>
-        </w:rPr>
-        <w:t>{%p endif %}</w:t>
-      </w:r>
-      <w:r>
-        <w:rPr>
-          <w:color w:val="222222"/>
-        </w:rPr>
-        <w:t xml:space="preserve"> </w:t>
-      </w:r>
-      <w:r>
-        <w:rPr>
-          <w:color w:val="BFBFBF" w:themeColor="background1" w:themeShade="BF"/>
-        </w:rPr>
-        <w:t>// If Wayne</w:t>
-      </w:r>
-    </w:p>
-    <w:p>
-      <w:pPr>
-        <w:pStyle w:val="Heading3"/>
-      </w:pPr>
-      <w:r>
-        <w:t>Step 5: File your forms with filing fee</w:t>
-      </w:r>
-    </w:p>
-    <w:p>
-      <w:pPr>
-        <w:spacing w:before="180" w:after="180"/>
-        <w:rPr>
-          <w:color w:val="222222"/>
-        </w:rPr>
-      </w:pPr>
-      <w:r>
-        <w:rPr>
-          <w:color w:val="222222"/>
-        </w:rPr>
-        <w:t xml:space="preserve">{%p if </w:t>
-      </w:r>
-      <w:proofErr w:type="spellStart"/>
-      <w:r>
-        <w:rPr>
-          <w:color w:val="222222"/>
-        </w:rPr>
-        <w:t>county_choice</w:t>
-      </w:r>
-      <w:proofErr w:type="spellEnd"/>
-      <w:r>
-        <w:rPr>
           <w:color w:val="222222"/>
         </w:rPr>
         <w:t xml:space="preserve"> == “Wayne” %}</w:t>
@@ -2292,6 +2259,7 @@
         <w:rPr>
           <w:color w:val="222222"/>
         </w:rPr>
+        <w:lastRenderedPageBreak/>
         <w:t>Pay the filing fee or file a Fee Waiver Request along with the following documents:</w:t>
       </w:r>
     </w:p>
@@ -2320,6 +2288,22 @@
       </w:pPr>
       <w:r>
         <w:rPr>
+          <w:rFonts w:asciiTheme="minorHAnsi" w:eastAsia="Times New Roman" w:hAnsiTheme="minorHAnsi" w:cstheme="minorHAnsi"/>
+          <w:color w:val="000000"/>
+        </w:rPr>
+        <w:t>Verified Statement (if you are requesting spousal support)</w:t>
+      </w:r>
+    </w:p>
+    <w:p>
+      <w:pPr>
+        <w:numPr>
+          <w:ilvl w:val="0"/>
+          <w:numId w:val="11"/>
+        </w:numPr>
+        <w:spacing w:after="0"/>
+      </w:pPr>
+      <w:r>
+        <w:rPr>
           <w:color w:val="222222"/>
         </w:rPr>
         <w:t>Confidential Case Inventory</w:t>
@@ -2357,6 +2341,49 @@
           <w:color w:val="222222"/>
         </w:rPr>
         <w:t xml:space="preserve">The preferred method of filing is online through Wayne County's </w:t>
+      </w:r>
+      <w:hyperlink r:id="rId24">
+        <w:r>
+          <w:rPr>
+            <w:color w:val="1155CC"/>
+            <w:u w:val="single"/>
+          </w:rPr>
+          <w:t>Domestic Case Filings System</w:t>
+        </w:r>
+      </w:hyperlink>
+      <w:r>
+        <w:rPr>
+          <w:color w:val="222222"/>
+        </w:rPr>
+        <w:t>. Filing in person and thr</w:t>
+      </w:r>
+      <w:r>
+        <w:rPr>
+          <w:color w:val="222222"/>
+        </w:rPr>
+        <w:t>ough the mail are also options.</w:t>
+      </w:r>
+    </w:p>
+    <w:p>
+      <w:pPr>
+        <w:pStyle w:val="Heading5"/>
+      </w:pPr>
+      <w:r>
+        <w:t xml:space="preserve">- Filing Online: </w:t>
+      </w:r>
+    </w:p>
+    <w:p>
+      <w:pPr>
+        <w:spacing w:before="180" w:after="180"/>
+        <w:rPr>
+          <w:color w:val="222222"/>
+        </w:rPr>
+      </w:pPr>
+      <w:r>
+        <w:rPr>
+          <w:color w:val="222222"/>
+        </w:rPr>
+        <w:t xml:space="preserve">You can file your divorce forms through the </w:t>
       </w:r>
       <w:hyperlink r:id="rId25">
         <w:r>
@@ -2371,89 +2398,45 @@
         <w:rPr>
           <w:color w:val="222222"/>
         </w:rPr>
-        <w:t>. Filing in person and thr</w:t>
-      </w:r>
-      <w:r>
-        <w:rPr>
-          <w:color w:val="222222"/>
-        </w:rPr>
-        <w:t>ough the mail are also options.</w:t>
-      </w:r>
-    </w:p>
-    <w:p>
-      <w:pPr>
-        <w:pStyle w:val="Heading5"/>
-      </w:pPr>
-      <w:r>
-        <w:lastRenderedPageBreak/>
-        <w:t xml:space="preserve">- Filing Online: </w:t>
-      </w:r>
-    </w:p>
-    <w:p>
-      <w:pPr>
-        <w:spacing w:before="180" w:after="180"/>
-        <w:rPr>
-          <w:color w:val="222222"/>
-        </w:rPr>
-      </w:pPr>
-      <w:r>
-        <w:rPr>
-          <w:color w:val="222222"/>
-        </w:rPr>
-        <w:t xml:space="preserve">You can file your divorce forms through the </w:t>
+        <w:t>.</w:t>
+      </w:r>
+    </w:p>
+    <w:p>
+      <w:pPr>
+        <w:spacing w:before="180" w:after="180"/>
+        <w:rPr>
+          <w:b/>
+          <w:color w:val="222222"/>
+        </w:rPr>
+      </w:pPr>
+      <w:r>
+        <w:rPr>
+          <w:color w:val="222222"/>
+        </w:rPr>
+        <w:t xml:space="preserve">The Domestic Case Filings System may be used Monday through Friday, 8:00 a.m. to 4:00 p.m. </w:t>
+      </w:r>
+      <w:r>
+        <w:rPr>
+          <w:b/>
+          <w:color w:val="222222"/>
+        </w:rPr>
+        <w:t>The System is not available in the evenings, on weekends, or on Court holidays.</w:t>
+      </w:r>
+    </w:p>
+    <w:p>
+      <w:pPr>
+        <w:spacing w:before="180" w:after="180"/>
+        <w:rPr>
+          <w:color w:val="222222"/>
+        </w:rPr>
+      </w:pPr>
+      <w:r>
+        <w:rPr>
+          <w:color w:val="222222"/>
+        </w:rPr>
+        <w:t xml:space="preserve">You will need to click "Create a new account" to begin. You can find instructions on creating an account on </w:t>
       </w:r>
       <w:hyperlink r:id="rId26">
-        <w:r>
-          <w:rPr>
-            <w:color w:val="1155CC"/>
-            <w:u w:val="single"/>
-          </w:rPr>
-          <w:t>Domestic Case Filings System</w:t>
-        </w:r>
-      </w:hyperlink>
-      <w:r>
-        <w:rPr>
-          <w:color w:val="222222"/>
-        </w:rPr>
-        <w:t>.</w:t>
-      </w:r>
-    </w:p>
-    <w:p>
-      <w:pPr>
-        <w:spacing w:before="180" w:after="180"/>
-        <w:rPr>
-          <w:b/>
-          <w:color w:val="222222"/>
-        </w:rPr>
-      </w:pPr>
-      <w:r>
-        <w:rPr>
-          <w:color w:val="222222"/>
-        </w:rPr>
-        <w:t xml:space="preserve">The Domestic Case Filings System may be used Monday through Friday, 8:00 a.m. to 4:00 p.m. </w:t>
-      </w:r>
-      <w:r>
-        <w:rPr>
-          <w:b/>
-          <w:color w:val="222222"/>
-        </w:rPr>
-        <w:t>The System is not available in the evenings, on weekends, or on Court holidays.</w:t>
-      </w:r>
-    </w:p>
-    <w:p>
-      <w:pPr>
-        <w:spacing w:before="180" w:after="180"/>
-        <w:rPr>
-          <w:color w:val="222222"/>
-        </w:rPr>
-      </w:pPr>
-      <w:r>
-        <w:rPr>
-          <w:color w:val="222222"/>
-        </w:rPr>
-        <w:t xml:space="preserve">You will need to click "Create a new account" to begin. You can find instructions on creating an account on </w:t>
-      </w:r>
-      <w:hyperlink r:id="rId27">
         <w:r>
           <w:rPr>
             <w:color w:val="1155CC"/>
@@ -2482,7 +2465,7 @@
         </w:rPr>
         <w:t xml:space="preserve">After you get the confirmation e-mail that your case has been accepted for filing and assigned a docket number and judge, you will need to create a Summons on the </w:t>
       </w:r>
-      <w:hyperlink r:id="rId28">
+      <w:hyperlink r:id="rId27">
         <w:proofErr w:type="spellStart"/>
         <w:r>
           <w:rPr>
@@ -2526,7 +2509,7 @@
         </w:rPr>
         <w:t xml:space="preserve">read </w:t>
       </w:r>
-      <w:hyperlink r:id="rId29">
+      <w:hyperlink r:id="rId28">
         <w:r>
           <w:rPr>
             <w:color w:val="1155CC"/>
@@ -2643,120 +2626,88 @@
       <w:pPr>
         <w:spacing w:before="180" w:after="180"/>
         <w:rPr>
+          <w:color w:val="222222"/>
+        </w:rPr>
+      </w:pPr>
+      <w:r>
+        <w:rPr>
+          <w:color w:val="222222"/>
+        </w:rPr>
+        <w:t>The clerk will stamp and file your Complaint for Divorce. You will get a case number and your case will be assigned to a judge at this time.</w:t>
+      </w:r>
+    </w:p>
+    <w:p>
+      <w:pPr>
+        <w:spacing w:before="180" w:after="180"/>
+        <w:rPr>
+          <w:color w:val="222222"/>
+        </w:rPr>
+      </w:pPr>
+      <w:r>
+        <w:rPr>
+          <w:color w:val="222222"/>
+        </w:rPr>
+        <w:t xml:space="preserve">If you are filing in person, the clerk will </w:t>
+      </w:r>
+      <w:r>
+        <w:t>print a Summons and labels for you. You must sign the Summons and attach labels to each copy of the Complaint and on the reverse side of the Summons, which is your Proof of Service. Keep the rest of the labels to use</w:t>
+      </w:r>
+      <w:r>
+        <w:rPr>
+          <w:color w:val="222222"/>
+        </w:rPr>
+        <w:t xml:space="preserve"> later. You must attach a label to every document that you file in your case, and you must have several labels served on your spouse. Your spouse must also attach labels to any papers they file in your divorce.</w:t>
+      </w:r>
+    </w:p>
+    <w:p>
+      <w:pPr>
+        <w:pStyle w:val="Heading5"/>
+      </w:pPr>
+      <w:r>
+        <w:lastRenderedPageBreak/>
+        <w:t>- Filing by Mail:</w:t>
+      </w:r>
+    </w:p>
+    <w:p>
+      <w:pPr>
+        <w:spacing w:before="180" w:after="180"/>
+        <w:rPr>
+          <w:color w:val="222222"/>
+        </w:rPr>
+      </w:pPr>
+      <w:r>
+        <w:rPr>
+          <w:color w:val="222222"/>
+        </w:rPr>
+        <w:t>You could also choose to file by mail. Parties and attorneys may continue to mail filings to the Wayne County Clerk by addressing them to Wayne County Clerk, Room 201, Coleman A. Young Municipal Center, Two Woodward Avenue, 48226.</w:t>
+      </w:r>
+    </w:p>
+    <w:p>
+      <w:pPr>
+        <w:spacing w:before="180" w:after="180"/>
+      </w:pPr>
+      <w:r>
+        <w:rPr>
           <w:b/>
           <w:color w:val="222222"/>
         </w:rPr>
-      </w:pPr>
+        <w:t xml:space="preserve">No matter which filing method you used, also e-mail a Judge’s Copy of each filing to the Assigned Judge’s email listed </w:t>
+      </w:r>
       <w:r>
         <w:rPr>
           <w:b/>
           <w:color w:val="222222"/>
         </w:rPr>
-        <w:t xml:space="preserve">Visit the </w:t>
-      </w:r>
-      <w:hyperlink r:id="rId30" w:anchor="IPFilingSafetyReq">
-        <w:r>
-          <w:rPr>
-            <w:b/>
-            <w:color w:val="1155CC"/>
-            <w:u w:val="single"/>
-          </w:rPr>
-          <w:t>Third Circuit Court website</w:t>
-        </w:r>
-      </w:hyperlink>
+        <w:t>at</w:t>
+      </w:r>
       <w:r>
         <w:rPr>
           <w:b/>
           <w:color w:val="222222"/>
         </w:rPr>
-        <w:t xml:space="preserve"> for information about in-person filing safety requirements.</w:t>
-      </w:r>
-    </w:p>
-    <w:p>
-      <w:pPr>
-        <w:spacing w:before="180" w:after="180"/>
-        <w:rPr>
-          <w:color w:val="222222"/>
-        </w:rPr>
-      </w:pPr>
-      <w:r>
-        <w:rPr>
-          <w:color w:val="222222"/>
-        </w:rPr>
-        <w:t>The clerk will stamp and file your Complaint for Divorce. You will get a case number and your case will be assigned to a judge at this time.</w:t>
-      </w:r>
-    </w:p>
-    <w:p>
-      <w:pPr>
-        <w:spacing w:before="180" w:after="180"/>
-        <w:rPr>
-          <w:color w:val="222222"/>
-        </w:rPr>
-      </w:pPr>
-      <w:r>
-        <w:rPr>
-          <w:color w:val="222222"/>
-        </w:rPr>
-        <w:t xml:space="preserve">If you are filing in person, the clerk will </w:t>
-      </w:r>
-      <w:r>
-        <w:t>print a Summons and labels for you. You must sign the Summons and attach labels to each copy of the Complaint and on the reverse side of the Summons, which is your Proof of Service. Keep the rest of the labels to use</w:t>
-      </w:r>
-      <w:r>
-        <w:rPr>
-          <w:color w:val="222222"/>
-        </w:rPr>
-        <w:t xml:space="preserve"> later. You must attach a label to every document that you file in your case, and you must have several labels served on your spouse. Your spouse must also attach labels to any papers they file in your divorce.</w:t>
-      </w:r>
-    </w:p>
-    <w:p>
-      <w:pPr>
-        <w:pStyle w:val="Heading5"/>
-      </w:pPr>
-      <w:r>
-        <w:t>- Filing by Mail:</w:t>
-      </w:r>
-    </w:p>
-    <w:p>
-      <w:pPr>
-        <w:spacing w:before="180" w:after="180"/>
-        <w:rPr>
-          <w:color w:val="222222"/>
-        </w:rPr>
-      </w:pPr>
-      <w:r>
-        <w:rPr>
-          <w:color w:val="222222"/>
-        </w:rPr>
-        <w:t>You could also choose to file by mail. Parties and attorneys may continue to mail filings to the Wayne County Clerk by addressing them to Wayne County Clerk, Room 201, Coleman A. Young Municipal Center, Two Woodward Avenue, 48226.</w:t>
-      </w:r>
-    </w:p>
-    <w:p>
-      <w:pPr>
-        <w:spacing w:before="180" w:after="180"/>
-      </w:pPr>
-      <w:r>
-        <w:rPr>
-          <w:b/>
-          <w:color w:val="222222"/>
-        </w:rPr>
-        <w:t xml:space="preserve">No matter which filing method you used, also e-mail a Judge’s Copy of each filing to the Assigned Judge’s email listed </w:t>
-      </w:r>
-      <w:r>
-        <w:rPr>
-          <w:b/>
-          <w:color w:val="222222"/>
-        </w:rPr>
-        <w:t>at</w:t>
-      </w:r>
-      <w:r>
-        <w:rPr>
-          <w:b/>
-          <w:color w:val="222222"/>
-        </w:rPr>
         <w:t xml:space="preserve"> </w:t>
       </w:r>
-      <w:hyperlink r:id="rId31" w:history="1">
+      <w:hyperlink r:id="rId29" w:history="1">
         <w:r>
           <w:rPr>
             <w:rStyle w:val="Hyperlink"/>
@@ -2823,12 +2774,24 @@
         <w:rPr>
           <w:color w:val="BFBFBF" w:themeColor="background1" w:themeShade="BF"/>
         </w:rPr>
-        <w:t xml:space="preserve">if </w:t>
+        <w:t>i</w:t>
       </w:r>
       <w:r>
         <w:rPr>
           <w:color w:val="BFBFBF" w:themeColor="background1" w:themeShade="BF"/>
         </w:rPr>
+        <w:t>.e. not</w:t>
+      </w:r>
+      <w:r>
+        <w:rPr>
+          <w:color w:val="BFBFBF" w:themeColor="background1" w:themeShade="BF"/>
+        </w:rPr>
+        <w:t xml:space="preserve"> </w:t>
+      </w:r>
+      <w:r>
+        <w:rPr>
+          <w:color w:val="BFBFBF" w:themeColor="background1" w:themeShade="BF"/>
+        </w:rPr>
         <w:t>Wayne</w:t>
       </w:r>
     </w:p>
@@ -2872,7 +2835,6 @@
           <w:b/>
           <w:color w:val="222222"/>
         </w:rPr>
-        <w:lastRenderedPageBreak/>
         <w:t xml:space="preserve">Oakland County </w:t>
       </w:r>
       <w:r>
@@ -2918,8 +2880,7 @@
         </w:rPr>
         <w:t xml:space="preserve">Upload your documents in </w:t>
       </w:r>
-      <w:hyperlink r:id="rId32">
-        <w:proofErr w:type="spellStart"/>
+      <w:hyperlink r:id="rId30">
         <w:r>
           <w:rPr>
             <w:rStyle w:val="Hyperlink"/>
@@ -2929,160 +2890,167 @@
           </w:rPr>
           <w:t>MiFILE</w:t>
         </w:r>
-        <w:proofErr w:type="spellEnd"/>
       </w:hyperlink>
       <w:r>
         <w:rPr>
           <w:b/>
           <w:color w:val="222222"/>
         </w:rPr>
-        <w:t xml:space="preserve">. Within </w:t>
+        <w:t xml:space="preserve">. Within MiFILE, you will need to choose a drop down label for each individual document you upload. Choose "NEW CASE FILING FEE - $175.00" for the Complaint, and "MISCELLANEOUS - $0.00" for all other documents. </w:t>
+      </w:r>
+    </w:p>
+    <w:p>
+      <w:pPr>
+        <w:spacing w:before="180" w:after="180"/>
+        <w:rPr>
+          <w:color w:val="222222"/>
+        </w:rPr>
+      </w:pPr>
+      <w:r>
+        <w:rPr>
+          <w:color w:val="222222"/>
+        </w:rPr>
+        <w:t>{%</w:t>
+      </w:r>
+      <w:r>
+        <w:rPr>
+          <w:color w:val="222222"/>
+        </w:rPr>
+        <w:t>p</w:t>
+      </w:r>
+      <w:r>
+        <w:rPr>
+          <w:color w:val="222222"/>
+        </w:rPr>
+        <w:t xml:space="preserve"> </w:t>
       </w:r>
       <w:proofErr w:type="spellStart"/>
       <w:r>
         <w:rPr>
+          <w:color w:val="222222"/>
+        </w:rPr>
+        <w:t>el</w:t>
+      </w:r>
+      <w:r>
+        <w:rPr>
+          <w:color w:val="222222"/>
+        </w:rPr>
+        <w:t>if</w:t>
+      </w:r>
+      <w:proofErr w:type="spellEnd"/>
+      <w:r>
+        <w:rPr>
+          <w:color w:val="222222"/>
+        </w:rPr>
+        <w:t xml:space="preserve"> </w:t>
+      </w:r>
+      <w:proofErr w:type="spellStart"/>
+      <w:r>
+        <w:rPr>
+          <w:color w:val="222222"/>
+        </w:rPr>
+        <w:t>county_choice</w:t>
+      </w:r>
+      <w:proofErr w:type="spellEnd"/>
+      <w:r>
+        <w:rPr>
+          <w:color w:val="222222"/>
+        </w:rPr>
+        <w:t xml:space="preserve"> not in “</w:t>
+      </w:r>
+      <w:proofErr w:type="spellStart"/>
+      <w:r>
+        <w:rPr>
+          <w:color w:val="222222"/>
+        </w:rPr>
+        <w:t>Allegan|Ingham|Lenawee|Ottawa</w:t>
+      </w:r>
+      <w:proofErr w:type="spellEnd"/>
+      <w:r>
+        <w:rPr>
+          <w:color w:val="222222"/>
+        </w:rPr>
+        <w:t>” %}</w:t>
+      </w:r>
+    </w:p>
+    <w:p>
+      <w:pPr>
+        <w:spacing w:before="180" w:after="180"/>
+        <w:rPr>
+          <w:color w:val="222222"/>
+        </w:rPr>
+      </w:pPr>
+      <w:r>
+        <w:rPr>
           <w:b/>
           <w:color w:val="222222"/>
         </w:rPr>
-        <w:t>MiFILE</w:t>
-      </w:r>
-      <w:proofErr w:type="spellEnd"/>
+        <w:t xml:space="preserve">Please note that completing the documents on Michigan Legal Help or </w:t>
+      </w:r>
       <w:r>
         <w:rPr>
           <w:b/>
           <w:color w:val="222222"/>
         </w:rPr>
-        <w:t xml:space="preserve">, you will need to choose a drop down label for each individual document you upload. Choose "NEW CASE FILING FEE - $175.00" for the Complaint, and "MISCELLANEOUS - $0.00" for all other documents. </w:t>
-      </w:r>
-    </w:p>
-    <w:p>
-      <w:pPr>
-        <w:spacing w:before="180" w:after="180"/>
-        <w:rPr>
-          <w:color w:val="222222"/>
-        </w:rPr>
-      </w:pPr>
-      <w:r>
-        <w:rPr>
-          <w:color w:val="222222"/>
-        </w:rPr>
-        <w:t>{%</w:t>
-      </w:r>
-      <w:r>
-        <w:rPr>
-          <w:color w:val="222222"/>
-        </w:rPr>
-        <w:t>p</w:t>
-      </w:r>
-      <w:r>
-        <w:rPr>
-          <w:color w:val="222222"/>
-        </w:rPr>
-        <w:t xml:space="preserve"> </w:t>
-      </w:r>
-      <w:proofErr w:type="spellStart"/>
-      <w:r>
-        <w:rPr>
-          <w:color w:val="222222"/>
-        </w:rPr>
-        <w:t>el</w:t>
-      </w:r>
-      <w:r>
-        <w:rPr>
-          <w:color w:val="222222"/>
-        </w:rPr>
-        <w:t>if</w:t>
-      </w:r>
-      <w:proofErr w:type="spellEnd"/>
-      <w:r>
-        <w:rPr>
-          <w:color w:val="222222"/>
-        </w:rPr>
-        <w:t xml:space="preserve"> </w:t>
-      </w:r>
-      <w:proofErr w:type="spellStart"/>
-      <w:r>
-        <w:rPr>
-          <w:color w:val="222222"/>
-        </w:rPr>
-        <w:t>county_choice</w:t>
-      </w:r>
-      <w:proofErr w:type="spellEnd"/>
-      <w:r>
-        <w:rPr>
-          <w:color w:val="222222"/>
-        </w:rPr>
-        <w:t xml:space="preserve"> not in “</w:t>
-      </w:r>
-      <w:proofErr w:type="spellStart"/>
-      <w:r>
-        <w:rPr>
-          <w:color w:val="222222"/>
-        </w:rPr>
-        <w:t>Allegan|Ingham|Lenawee|Ottawa</w:t>
-      </w:r>
-      <w:proofErr w:type="spellEnd"/>
-      <w:r>
-        <w:rPr>
-          <w:color w:val="222222"/>
-        </w:rPr>
-        <w:t>” %}</w:t>
-      </w:r>
-    </w:p>
-    <w:p>
-      <w:pPr>
-        <w:spacing w:before="180" w:after="180"/>
-        <w:rPr>
-          <w:color w:val="222222"/>
-        </w:rPr>
-      </w:pPr>
+        <w:t>MLH-</w:t>
+      </w:r>
       <w:r>
         <w:rPr>
           <w:b/>
           <w:color w:val="222222"/>
         </w:rPr>
-        <w:t xml:space="preserve">Please note that completing the documents on Michigan Legal Help or </w:t>
+        <w:t>Forms</w:t>
       </w:r>
       <w:r>
         <w:rPr>
           <w:b/>
           <w:color w:val="222222"/>
         </w:rPr>
-        <w:t>MLH-</w:t>
-      </w:r>
-      <w:r>
-        <w:rPr>
-          <w:b/>
-          <w:color w:val="222222"/>
-        </w:rPr>
-        <w:t>Forms</w:t>
-      </w:r>
-      <w:r>
-        <w:rPr>
-          <w:b/>
-          <w:color w:val="222222"/>
-        </w:rPr>
         <w:t xml:space="preserve"> does not file anything with the court. </w:t>
       </w:r>
       <w:r>
         <w:rPr>
           <w:color w:val="222222"/>
         </w:rPr>
-        <w:t xml:space="preserve">Contact your court to find out which filing methods are available. Depending on your court, you may be able to file electronically. To learn more about filing methods that may be available, read Step 1. If you are e-filing using </w:t>
-      </w:r>
-      <w:proofErr w:type="spellStart"/>
-      <w:r>
-        <w:rPr>
-          <w:color w:val="222222"/>
-        </w:rPr>
-        <w:t>MiFILE</w:t>
-      </w:r>
-      <w:proofErr w:type="spellEnd"/>
-      <w:r>
-        <w:rPr>
-          <w:color w:val="222222"/>
-        </w:rPr>
-        <w:t>, you will need to know the case-type code. The case type code for divorce without minor children is DO.</w:t>
+        <w:t>Contact your court to find out which filing methods are available. Depending on your court, you may be able to file electronically. If you are e-filing using MiFILE, you will need to know the case-type code. The case type code for divorce without minor children is DO.</w:t>
+      </w:r>
+    </w:p>
+    <w:p>
+      <w:pPr>
+        <w:spacing w:before="180" w:after="180"/>
+        <w:rPr>
+          <w:color w:val="222222"/>
+        </w:rPr>
+      </w:pPr>
+      <w:hyperlink r:id="rId31" w:history="1">
+        <w:r>
+          <w:rPr>
+            <w:rStyle w:val="Hyperlink"/>
+            <w:color w:val="1155CC"/>
+          </w:rPr>
+          <w:t>MiFILE</w:t>
+        </w:r>
+      </w:hyperlink>
+      <w:r>
+        <w:rPr>
+          <w:color w:val="222222"/>
+        </w:rPr>
+        <w:t> is only available for some courts. Even in courts where it is available, you can only use it for some case types. Click this link to </w:t>
+      </w:r>
+      <w:hyperlink r:id="rId32" w:history="1">
+        <w:r>
+          <w:rPr>
+            <w:rStyle w:val="Hyperlink"/>
+            <w:color w:val="1155CC"/>
+          </w:rPr>
+          <w:t>check if you can e-file</w:t>
+        </w:r>
+      </w:hyperlink>
+      <w:r>
+        <w:rPr>
+          <w:color w:val="222222"/>
+        </w:rPr>
+        <w:t>. </w:t>
       </w:r>
     </w:p>
     <w:p>
@@ -3541,6 +3509,7 @@
         <w:rPr>
           <w:color w:val="222222"/>
         </w:rPr>
+        <w:lastRenderedPageBreak/>
         <w:t>{%p else %}</w:t>
       </w:r>
     </w:p>
@@ -3600,6 +3569,37 @@
           <w:color w:val="222222"/>
         </w:rPr>
         <w:t>Complaint for Divorce</w:t>
+      </w:r>
+    </w:p>
+    <w:p>
+      <w:pPr>
+        <w:numPr>
+          <w:ilvl w:val="0"/>
+          <w:numId w:val="2"/>
+        </w:numPr>
+        <w:spacing w:after="0"/>
+      </w:pPr>
+      <w:r>
+        <w:rPr>
+          <w:rFonts w:asciiTheme="minorHAnsi" w:eastAsia="Times New Roman" w:hAnsiTheme="minorHAnsi" w:cstheme="minorHAnsi"/>
+          <w:color w:val="000000"/>
+        </w:rPr>
+        <w:t>Verified Statement</w:t>
+      </w:r>
+      <w:r>
+        <w:rPr>
+          <w:rFonts w:asciiTheme="minorHAnsi" w:eastAsia="Times New Roman" w:hAnsiTheme="minorHAnsi" w:cstheme="minorHAnsi"/>
+          <w:color w:val="000000"/>
+        </w:rPr>
+        <w:t xml:space="preserve">* </w:t>
+      </w:r>
+      <w:r>
+        <w:rPr>
+          <w:rFonts w:asciiTheme="minorHAnsi" w:eastAsia="Times New Roman" w:hAnsiTheme="minorHAnsi" w:cstheme="minorHAnsi"/>
+          <w:color w:val="000000"/>
+          <w:u w:val="single"/>
+        </w:rPr>
+        <w:t>(File only if you requested spousal support in your Complaint for Divorce. You may need to submit this form differently than the other forms. Learn more below.)</w:t>
       </w:r>
     </w:p>
     <w:p>
@@ -3810,7 +3810,6 @@
         <w:rPr>
           <w:color w:val="222222"/>
         </w:rPr>
-        <w:lastRenderedPageBreak/>
         <w:t>Record of Divorce or Annulment</w:t>
       </w:r>
       <w:r>
@@ -4158,6 +4157,42 @@
         </w:rPr>
         <w:t xml:space="preserve"> %}</w:t>
       </w:r>
+      <w:r>
+        <w:rPr>
+          <w:color w:val="222222"/>
+        </w:rPr>
+        <w:t xml:space="preserve"> </w:t>
+      </w:r>
+      <w:r>
+        <w:rPr>
+          <w:color w:val="BFBFBF" w:themeColor="background1" w:themeShade="BF"/>
+        </w:rPr>
+        <w:t xml:space="preserve">// </w:t>
+      </w:r>
+      <w:r>
+        <w:rPr>
+          <w:color w:val="BFBFBF" w:themeColor="background1" w:themeShade="BF"/>
+        </w:rPr>
+        <w:t>i</w:t>
+      </w:r>
+      <w:r>
+        <w:rPr>
+          <w:color w:val="BFBFBF" w:themeColor="background1" w:themeShade="BF"/>
+        </w:rPr>
+        <w:t>.e. not</w:t>
+      </w:r>
+      <w:r>
+        <w:rPr>
+          <w:color w:val="BFBFBF" w:themeColor="background1" w:themeShade="BF"/>
+        </w:rPr>
+        <w:t xml:space="preserve"> </w:t>
+      </w:r>
+      <w:r>
+        <w:rPr>
+          <w:color w:val="BFBFBF" w:themeColor="background1" w:themeShade="BF"/>
+        </w:rPr>
+        <w:t>Oakland</w:t>
+      </w:r>
     </w:p>
     <w:p>
       <w:pPr>
@@ -4278,28 +4313,217 @@
         <w:rPr>
           <w:color w:val="222222"/>
         </w:rPr>
-        <w:t xml:space="preserve"> and all of the copies. {% </w:t>
+        <w:t xml:space="preserve"> and all of the copies. {% el</w:t>
+      </w:r>
+      <w:r>
+        <w:rPr>
+          <w:color w:val="222222"/>
+        </w:rPr>
+        <w:t xml:space="preserve">se </w:t>
+      </w:r>
+      <w:r>
+        <w:rPr>
+          <w:color w:val="222222"/>
+        </w:rPr>
+        <w:t>%}If you are filing in person at the court clerk's office, give the clerk all of the originals and all of the copies. {% endif %}</w:t>
+      </w:r>
+      <w:r>
+        <w:rPr>
+          <w:color w:val="222222"/>
+        </w:rPr>
+        <w:t>The clerk will assign a case number and a judge to your case and will stamp and sign the Summons. The clerk will return copies of all the divorce papers that the court doesn’t need.</w:t>
+      </w:r>
+    </w:p>
+    <w:p>
+      <w:pPr>
+        <w:spacing w:before="180" w:after="180"/>
+        <w:rPr>
+          <w:color w:val="222222"/>
+        </w:rPr>
+      </w:pPr>
+      <w:r>
+        <w:rPr>
+          <w:color w:val="222222"/>
+        </w:rPr>
+        <w:t>{%p endif %}</w:t>
+      </w:r>
+      <w:r>
+        <w:rPr>
+          <w:color w:val="222222"/>
+        </w:rPr>
+        <w:t xml:space="preserve"> </w:t>
+      </w:r>
+      <w:r>
+        <w:rPr>
+          <w:color w:val="BFBFBF" w:themeColor="background1" w:themeShade="BF"/>
+        </w:rPr>
+        <w:t xml:space="preserve">// </w:t>
+      </w:r>
+      <w:r>
+        <w:rPr>
+          <w:color w:val="BFBFBF" w:themeColor="background1" w:themeShade="BF"/>
+        </w:rPr>
+        <w:t xml:space="preserve">end </w:t>
+      </w:r>
+      <w:r>
+        <w:rPr>
+          <w:color w:val="BFBFBF" w:themeColor="background1" w:themeShade="BF"/>
+        </w:rPr>
+        <w:t>Oakland</w:t>
+      </w:r>
+      <w:r>
+        <w:rPr>
+          <w:color w:val="BFBFBF" w:themeColor="background1" w:themeShade="BF"/>
+        </w:rPr>
+        <w:t xml:space="preserve"> conditional</w:t>
+      </w:r>
+    </w:p>
+    <w:p>
+      <w:pPr>
+        <w:spacing w:before="180" w:after="180"/>
+        <w:rPr>
+          <w:color w:val="222222"/>
+        </w:rPr>
+      </w:pPr>
+      <w:r>
+        <w:rPr>
+          <w:color w:val="222222"/>
+          <w:highlight w:val="white"/>
+        </w:rPr>
+        <w:t xml:space="preserve">{p% if </w:t>
       </w:r>
       <w:proofErr w:type="spellStart"/>
       <w:r>
         <w:rPr>
           <w:color w:val="222222"/>
-        </w:rPr>
-        <w:t>el</w:t>
-      </w:r>
-      <w:r>
-        <w:rPr>
-          <w:color w:val="222222"/>
-        </w:rPr>
-        <w:t>if</w:t>
+          <w:highlight w:val="white"/>
+        </w:rPr>
+        <w:t>county_choice</w:t>
       </w:r>
       <w:proofErr w:type="spellEnd"/>
       <w:r>
         <w:rPr>
           <w:color w:val="222222"/>
+          <w:highlight w:val="white"/>
+        </w:rPr>
+        <w:t xml:space="preserve"> not in “</w:t>
+      </w:r>
+      <w:proofErr w:type="spellStart"/>
+      <w:r>
+        <w:rPr>
+          <w:color w:val="222222"/>
+          <w:highlight w:val="white"/>
+        </w:rPr>
+        <w:t>Allegan|Ingham|Lenawee|</w:t>
+      </w:r>
+      <w:r>
+        <w:rPr>
+          <w:color w:val="222222"/>
+          <w:highlight w:val="white"/>
+        </w:rPr>
+        <w:t>Oakland</w:t>
+      </w:r>
+      <w:r>
+        <w:rPr>
+          <w:color w:val="222222"/>
+          <w:highlight w:val="white"/>
+        </w:rPr>
+        <w:t>|Ottawa</w:t>
+      </w:r>
+      <w:proofErr w:type="spellEnd"/>
+      <w:r>
+        <w:rPr>
+          <w:color w:val="222222"/>
+          <w:highlight w:val="white"/>
+        </w:rPr>
+        <w:t>” %}</w:t>
+      </w:r>
+    </w:p>
+    <w:p>
+      <w:pPr>
+        <w:spacing w:before="180" w:after="180"/>
+        <w:rPr>
+          <w:color w:val="222222"/>
+        </w:rPr>
+      </w:pPr>
+      <w:r>
+        <w:rPr>
+          <w:b/>
+          <w:bCs/>
+          <w:color w:val="222222"/>
+        </w:rPr>
+        <w:t>*Verified Statement: </w:t>
+      </w:r>
+      <w:r>
+        <w:rPr>
+          <w:color w:val="222222"/>
+        </w:rPr>
+        <w:t>Ask the court clerk or the Friend of the Court (FOC) if you should submit the Verified Statement to the FOC directly or file it with your other forms.</w:t>
+      </w:r>
+      <w:r>
+        <w:rPr>
+          <w:color w:val="222222"/>
         </w:rPr>
         <w:t xml:space="preserve"> </w:t>
       </w:r>
+      <w:r>
+        <w:rPr>
+          <w:color w:val="222222"/>
+        </w:rPr>
+        <w:t>The Verified Statement belongs in the nonpublic FOC file instead of the public court file. Some courts will let you file it with the clerk</w:t>
+      </w:r>
+      <w:r>
+        <w:rPr>
+          <w:color w:val="222222"/>
+        </w:rPr>
+        <w:t>’</w:t>
+      </w:r>
+      <w:r>
+        <w:rPr>
+          <w:color w:val="222222"/>
+        </w:rPr>
+        <w:t>s office, and the clerk will separate it from the other filings and send it to the FOC. Other courts may want you to provide the Verified Statement to the FOC instead.</w:t>
+      </w:r>
+    </w:p>
+    <w:p>
+      <w:pPr>
+        <w:spacing w:before="180" w:after="180"/>
+        <w:rPr>
+          <w:color w:val="222222"/>
+        </w:rPr>
+      </w:pPr>
+      <w:r>
+        <w:rPr>
+          <w:color w:val="222222"/>
+        </w:rPr>
+        <w:t>{%p endif %}</w:t>
+      </w:r>
+    </w:p>
+    <w:p>
+      <w:pPr>
+        <w:spacing w:before="180" w:after="180"/>
+        <w:rPr>
+          <w:color w:val="222222"/>
+        </w:rPr>
+      </w:pPr>
+      <w:r>
+        <w:rPr>
+          <w:color w:val="222222"/>
+        </w:rPr>
+        <w:t>{%</w:t>
+      </w:r>
+      <w:r>
+        <w:rPr>
+          <w:color w:val="222222"/>
+        </w:rPr>
+        <w:t>p</w:t>
+      </w:r>
+      <w:r>
+        <w:rPr>
+          <w:color w:val="222222"/>
+        </w:rPr>
+        <w:t xml:space="preserve"> if </w:t>
+      </w:r>
       <w:proofErr w:type="spellStart"/>
       <w:r>
         <w:rPr>
@@ -4312,34 +4536,28 @@
         <w:rPr>
           <w:color w:val="222222"/>
         </w:rPr>
-        <w:t xml:space="preserve"> != “Oakland” </w:t>
-      </w:r>
-      <w:r>
-        <w:rPr>
-          <w:color w:val="222222"/>
-        </w:rPr>
-        <w:t>%}If you are filing in person at the court clerk's office, give the clerk all of the originals and all of the copies. {% endif %}</w:t>
-      </w:r>
-      <w:r>
-        <w:rPr>
-          <w:color w:val="222222"/>
-        </w:rPr>
-        <w:t>The clerk will assign a case number and a judge to your case and will stamp and sign the Summons. The clerk will return copies of all the divorce papers that the court doesn’t need.</w:t>
-      </w:r>
-    </w:p>
-    <w:p>
-      <w:pPr>
-        <w:spacing w:before="180" w:after="180"/>
-        <w:rPr>
-          <w:color w:val="222222"/>
-          <w:highlight w:val="white"/>
-        </w:rPr>
-      </w:pPr>
-      <w:r>
-        <w:rPr>
-          <w:color w:val="222222"/>
-        </w:rPr>
-        <w:t>{%p endif %}</w:t>
+        <w:t xml:space="preserve"> == “Lenawee” %}</w:t>
+      </w:r>
+    </w:p>
+    <w:p>
+      <w:pPr>
+        <w:spacing w:before="180" w:after="180"/>
+        <w:rPr>
+          <w:color w:val="222222"/>
+        </w:rPr>
+      </w:pPr>
+      <w:r>
+        <w:rPr>
+          <w:color w:val="222222"/>
+        </w:rPr>
+        <w:lastRenderedPageBreak/>
+        <w:t>The clerk will also give you a yellow form called Pre-Trial Notice &amp;/or Notice of Taking Judgment. Keep a copy of this form for yourself and to</w:t>
+      </w:r>
+      <w:r>
+        <w:rPr>
+          <w:color w:val="222222"/>
+        </w:rPr>
+        <w:t xml:space="preserve"> serve on your spouse (Step 6).</w:t>
       </w:r>
     </w:p>
     <w:p>
@@ -4365,6 +4583,32 @@
         <w:rPr>
           <w:color w:val="222222"/>
         </w:rPr>
+        <w:t xml:space="preserve"> endif %}</w:t>
+      </w:r>
+    </w:p>
+    <w:p>
+      <w:pPr>
+        <w:spacing w:before="180" w:after="180"/>
+        <w:rPr>
+          <w:color w:val="222222"/>
+        </w:rPr>
+      </w:pPr>
+      <w:r>
+        <w:rPr>
+          <w:color w:val="222222"/>
+        </w:rPr>
+        <w:t>{%</w:t>
+      </w:r>
+      <w:r>
+        <w:rPr>
+          <w:color w:val="222222"/>
+        </w:rPr>
+        <w:t>p</w:t>
+      </w:r>
+      <w:r>
+        <w:rPr>
+          <w:color w:val="222222"/>
+        </w:rPr>
         <w:t xml:space="preserve"> if </w:t>
       </w:r>
       <w:proofErr w:type="spellStart"/>
@@ -4379,92 +4623,6 @@
         <w:rPr>
           <w:color w:val="222222"/>
         </w:rPr>
-        <w:t xml:space="preserve"> == “Lenawee” %}</w:t>
-      </w:r>
-    </w:p>
-    <w:p>
-      <w:pPr>
-        <w:spacing w:before="180" w:after="180"/>
-        <w:rPr>
-          <w:color w:val="222222"/>
-        </w:rPr>
-      </w:pPr>
-      <w:r>
-        <w:rPr>
-          <w:color w:val="222222"/>
-        </w:rPr>
-        <w:t>The clerk will also give you a yellow form called Pre-Trial Notice &amp;/or Notice of Taking Judgment. Keep a copy of this form for yourself and to</w:t>
-      </w:r>
-      <w:r>
-        <w:rPr>
-          <w:color w:val="222222"/>
-        </w:rPr>
-        <w:t xml:space="preserve"> serve on your spouse (Step 6).</w:t>
-      </w:r>
-    </w:p>
-    <w:p>
-      <w:pPr>
-        <w:spacing w:before="180" w:after="180"/>
-        <w:rPr>
-          <w:color w:val="222222"/>
-        </w:rPr>
-      </w:pPr>
-      <w:r>
-        <w:rPr>
-          <w:color w:val="222222"/>
-        </w:rPr>
-        <w:t>{%</w:t>
-      </w:r>
-      <w:r>
-        <w:rPr>
-          <w:color w:val="222222"/>
-        </w:rPr>
-        <w:t>p</w:t>
-      </w:r>
-      <w:r>
-        <w:rPr>
-          <w:color w:val="222222"/>
-        </w:rPr>
-        <w:t xml:space="preserve"> endif %}</w:t>
-      </w:r>
-    </w:p>
-    <w:p>
-      <w:pPr>
-        <w:spacing w:before="180" w:after="180"/>
-        <w:rPr>
-          <w:color w:val="222222"/>
-        </w:rPr>
-      </w:pPr>
-      <w:r>
-        <w:rPr>
-          <w:color w:val="222222"/>
-        </w:rPr>
-        <w:t>{%</w:t>
-      </w:r>
-      <w:r>
-        <w:rPr>
-          <w:color w:val="222222"/>
-        </w:rPr>
-        <w:t>p</w:t>
-      </w:r>
-      <w:r>
-        <w:rPr>
-          <w:color w:val="222222"/>
-        </w:rPr>
-        <w:t xml:space="preserve"> if </w:t>
-      </w:r>
-      <w:proofErr w:type="spellStart"/>
-      <w:r>
-        <w:rPr>
-          <w:color w:val="222222"/>
-        </w:rPr>
-        <w:t>county_choice</w:t>
-      </w:r>
-      <w:proofErr w:type="spellEnd"/>
-      <w:r>
-        <w:rPr>
-          <w:color w:val="222222"/>
-        </w:rPr>
         <w:t xml:space="preserve"> == “Ottawa” %}</w:t>
       </w:r>
     </w:p>
@@ -4482,7 +4640,6 @@
         <w:t xml:space="preserve">Note that in Ottawa County, everything you file in your case after this initial filing will need to be e-filed using </w:t>
       </w:r>
       <w:hyperlink r:id="rId39" w:history="1">
-        <w:proofErr w:type="spellStart"/>
         <w:r>
           <w:rPr>
             <w:rStyle w:val="Hyperlink"/>
@@ -4490,7 +4647,6 @@
           </w:rPr>
           <w:t>MiFILE</w:t>
         </w:r>
-        <w:proofErr w:type="spellEnd"/>
       </w:hyperlink>
       <w:r>
         <w:rPr>
@@ -4626,13 +4782,25 @@
         <w:rPr>
           <w:color w:val="BFBFBF" w:themeColor="background1" w:themeShade="BF"/>
         </w:rPr>
-        <w:t xml:space="preserve">if </w:t>
+        <w:t>end</w:t>
       </w:r>
       <w:r>
         <w:rPr>
           <w:color w:val="BFBFBF" w:themeColor="background1" w:themeShade="BF"/>
         </w:rPr>
+        <w:t xml:space="preserve"> </w:t>
+      </w:r>
+      <w:r>
+        <w:rPr>
+          <w:color w:val="BFBFBF" w:themeColor="background1" w:themeShade="BF"/>
+        </w:rPr>
         <w:t>Wayne</w:t>
+      </w:r>
+      <w:r>
+        <w:rPr>
+          <w:color w:val="BFBFBF" w:themeColor="background1" w:themeShade="BF"/>
+        </w:rPr>
+        <w:t xml:space="preserve"> conditional</w:t>
       </w:r>
     </w:p>
     <w:p>
@@ -4746,7 +4914,6 @@
         <w:rPr>
           <w:color w:val="222222"/>
         </w:rPr>
-        <w:lastRenderedPageBreak/>
         <w:t>Fee Waiver Request and the decision on your request (if you filed a Fee Waiver Request)</w:t>
       </w:r>
     </w:p>
@@ -4784,6 +4951,24 @@
           <w:color w:val="222222"/>
         </w:rPr>
         <w:t>Complaint for Divorce</w:t>
+      </w:r>
+    </w:p>
+    <w:p>
+      <w:pPr>
+        <w:numPr>
+          <w:ilvl w:val="0"/>
+          <w:numId w:val="2"/>
+        </w:numPr>
+        <w:spacing w:after="0"/>
+        <w:rPr>
+          <w:color w:val="222222"/>
+        </w:rPr>
+      </w:pPr>
+      <w:r>
+        <w:rPr>
+          <w:color w:val="222222"/>
+        </w:rPr>
+        <w:t>Verified Statement (if you are requesting spousal support)</w:t>
       </w:r>
     </w:p>
     <w:p>
@@ -5861,6 +6046,119 @@
     </w:lvl>
   </w:abstractNum>
   <w:abstractNum w:abstractNumId="8" w15:restartNumberingAfterBreak="0">
+    <w:nsid w:val="4F455AB1"/>
+    <w:multiLevelType w:val="hybridMultilevel"/>
+    <w:tmpl w:val="F7C85DD6"/>
+    <w:lvl w:ilvl="0" w:tplc="04090001">
+      <w:start w:val="1"/>
+      <w:numFmt w:val="bullet"/>
+      <w:lvlText w:val=""/>
+      <w:lvlJc w:val="left"/>
+      <w:pPr>
+        <w:ind w:left="720" w:hanging="360"/>
+      </w:pPr>
+      <w:rPr>
+        <w:rFonts w:ascii="Symbol" w:hAnsi="Symbol" w:hint="default"/>
+      </w:rPr>
+    </w:lvl>
+    <w:lvl w:ilvl="1" w:tplc="04090003" w:tentative="1">
+      <w:start w:val="1"/>
+      <w:numFmt w:val="bullet"/>
+      <w:lvlText w:val="o"/>
+      <w:lvlJc w:val="left"/>
+      <w:pPr>
+        <w:ind w:left="1440" w:hanging="360"/>
+      </w:pPr>
+      <w:rPr>
+        <w:rFonts w:ascii="Courier New" w:hAnsi="Courier New" w:cs="Courier New" w:hint="default"/>
+      </w:rPr>
+    </w:lvl>
+    <w:lvl w:ilvl="2" w:tplc="04090005" w:tentative="1">
+      <w:start w:val="1"/>
+      <w:numFmt w:val="bullet"/>
+      <w:lvlText w:val=""/>
+      <w:lvlJc w:val="left"/>
+      <w:pPr>
+        <w:ind w:left="2160" w:hanging="360"/>
+      </w:pPr>
+      <w:rPr>
+        <w:rFonts w:ascii="Wingdings" w:hAnsi="Wingdings" w:hint="default"/>
+      </w:rPr>
+    </w:lvl>
+    <w:lvl w:ilvl="3" w:tplc="04090001" w:tentative="1">
+      <w:start w:val="1"/>
+      <w:numFmt w:val="bullet"/>
+      <w:lvlText w:val=""/>
+      <w:lvlJc w:val="left"/>
+      <w:pPr>
+        <w:ind w:left="2880" w:hanging="360"/>
+      </w:pPr>
+      <w:rPr>
+        <w:rFonts w:ascii="Symbol" w:hAnsi="Symbol" w:hint="default"/>
+      </w:rPr>
+    </w:lvl>
+    <w:lvl w:ilvl="4" w:tplc="04090003" w:tentative="1">
+      <w:start w:val="1"/>
+      <w:numFmt w:val="bullet"/>
+      <w:lvlText w:val="o"/>
+      <w:lvlJc w:val="left"/>
+      <w:pPr>
+        <w:ind w:left="3600" w:hanging="360"/>
+      </w:pPr>
+      <w:rPr>
+        <w:rFonts w:ascii="Courier New" w:hAnsi="Courier New" w:cs="Courier New" w:hint="default"/>
+      </w:rPr>
+    </w:lvl>
+    <w:lvl w:ilvl="5" w:tplc="04090005" w:tentative="1">
+      <w:start w:val="1"/>
+      <w:numFmt w:val="bullet"/>
+      <w:lvlText w:val=""/>
+      <w:lvlJc w:val="left"/>
+      <w:pPr>
+        <w:ind w:left="4320" w:hanging="360"/>
+      </w:pPr>
+      <w:rPr>
+        <w:rFonts w:ascii="Wingdings" w:hAnsi="Wingdings" w:hint="default"/>
+      </w:rPr>
+    </w:lvl>
+    <w:lvl w:ilvl="6" w:tplc="04090001" w:tentative="1">
+      <w:start w:val="1"/>
+      <w:numFmt w:val="bullet"/>
+      <w:lvlText w:val=""/>
+      <w:lvlJc w:val="left"/>
+      <w:pPr>
+        <w:ind w:left="5040" w:hanging="360"/>
+      </w:pPr>
+      <w:rPr>
+        <w:rFonts w:ascii="Symbol" w:hAnsi="Symbol" w:hint="default"/>
+      </w:rPr>
+    </w:lvl>
+    <w:lvl w:ilvl="7" w:tplc="04090003" w:tentative="1">
+      <w:start w:val="1"/>
+      <w:numFmt w:val="bullet"/>
+      <w:lvlText w:val="o"/>
+      <w:lvlJc w:val="left"/>
+      <w:pPr>
+        <w:ind w:left="5760" w:hanging="360"/>
+      </w:pPr>
+      <w:rPr>
+        <w:rFonts w:ascii="Courier New" w:hAnsi="Courier New" w:cs="Courier New" w:hint="default"/>
+      </w:rPr>
+    </w:lvl>
+    <w:lvl w:ilvl="8" w:tplc="04090005" w:tentative="1">
+      <w:start w:val="1"/>
+      <w:numFmt w:val="bullet"/>
+      <w:lvlText w:val=""/>
+      <w:lvlJc w:val="left"/>
+      <w:pPr>
+        <w:ind w:left="6480" w:hanging="360"/>
+      </w:pPr>
+      <w:rPr>
+        <w:rFonts w:ascii="Wingdings" w:hAnsi="Wingdings" w:hint="default"/>
+      </w:rPr>
+    </w:lvl>
+  </w:abstractNum>
+  <w:abstractNum w:abstractNumId="9" w15:restartNumberingAfterBreak="0">
     <w:nsid w:val="589764A1"/>
     <w:multiLevelType w:val="multilevel"/>
     <w:tmpl w:val="8DAEEE7E"/>
@@ -5977,7 +6275,7 @@
       </w:rPr>
     </w:lvl>
   </w:abstractNum>
-  <w:abstractNum w:abstractNumId="9" w15:restartNumberingAfterBreak="0">
+  <w:abstractNum w:abstractNumId="10" w15:restartNumberingAfterBreak="0">
     <w:nsid w:val="59817B35"/>
     <w:multiLevelType w:val="multilevel"/>
     <w:tmpl w:val="CF5C92FC"/>
@@ -6094,7 +6392,7 @@
       </w:rPr>
     </w:lvl>
   </w:abstractNum>
-  <w:abstractNum w:abstractNumId="10" w15:restartNumberingAfterBreak="0">
+  <w:abstractNum w:abstractNumId="11" w15:restartNumberingAfterBreak="0">
     <w:nsid w:val="5CEE60AC"/>
     <w:multiLevelType w:val="multilevel"/>
     <w:tmpl w:val="0726B236"/>
@@ -6207,7 +6505,7 @@
       </w:rPr>
     </w:lvl>
   </w:abstractNum>
-  <w:abstractNum w:abstractNumId="11" w15:restartNumberingAfterBreak="0">
+  <w:abstractNum w:abstractNumId="12" w15:restartNumberingAfterBreak="0">
     <w:nsid w:val="6A325AE7"/>
     <w:multiLevelType w:val="multilevel"/>
     <w:tmpl w:val="4802C164"/>
@@ -6324,7 +6622,7 @@
       </w:rPr>
     </w:lvl>
   </w:abstractNum>
-  <w:abstractNum w:abstractNumId="12" w15:restartNumberingAfterBreak="0">
+  <w:abstractNum w:abstractNumId="13" w15:restartNumberingAfterBreak="0">
     <w:nsid w:val="6DD0149C"/>
     <w:multiLevelType w:val="multilevel"/>
     <w:tmpl w:val="AF44435E"/>
@@ -6441,7 +6739,7 @@
       </w:rPr>
     </w:lvl>
   </w:abstractNum>
-  <w:abstractNum w:abstractNumId="13" w15:restartNumberingAfterBreak="0">
+  <w:abstractNum w:abstractNumId="14" w15:restartNumberingAfterBreak="0">
     <w:nsid w:val="7AE27462"/>
     <w:multiLevelType w:val="hybridMultilevel"/>
     <w:tmpl w:val="0B5AFE8E"/>
@@ -6554,13 +6852,13 @@
     </w:lvl>
   </w:abstractNum>
   <w:num w:numId="1" w16cid:durableId="386344634">
-    <w:abstractNumId w:val="8"/>
+    <w:abstractNumId w:val="9"/>
   </w:num>
   <w:num w:numId="2" w16cid:durableId="476537505">
-    <w:abstractNumId w:val="12"/>
+    <w:abstractNumId w:val="13"/>
   </w:num>
   <w:num w:numId="3" w16cid:durableId="1204439392">
-    <w:abstractNumId w:val="11"/>
+    <w:abstractNumId w:val="12"/>
   </w:num>
   <w:num w:numId="4" w16cid:durableId="1330250068">
     <w:abstractNumId w:val="7"/>
@@ -6569,13 +6867,13 @@
     <w:abstractNumId w:val="0"/>
   </w:num>
   <w:num w:numId="6" w16cid:durableId="1095204439">
-    <w:abstractNumId w:val="9"/>
+    <w:abstractNumId w:val="10"/>
   </w:num>
   <w:num w:numId="7" w16cid:durableId="942998974">
     <w:abstractNumId w:val="6"/>
   </w:num>
   <w:num w:numId="8" w16cid:durableId="1721781134">
-    <w:abstractNumId w:val="10"/>
+    <w:abstractNumId w:val="11"/>
   </w:num>
   <w:num w:numId="9" w16cid:durableId="1072584620">
     <w:abstractNumId w:val="4"/>
@@ -6590,10 +6888,13 @@
     <w:abstractNumId w:val="2"/>
   </w:num>
   <w:num w:numId="13" w16cid:durableId="1263798956">
-    <w:abstractNumId w:val="13"/>
+    <w:abstractNumId w:val="14"/>
   </w:num>
   <w:num w:numId="14" w16cid:durableId="1493253481">
     <w:abstractNumId w:val="5"/>
+  </w:num>
+  <w:num w:numId="15" w16cid:durableId="1509635103">
+    <w:abstractNumId w:val="8"/>
   </w:num>
 </w:numbering>
 </file>

</xml_diff>